<commit_message>
Update report.docx for lab12 (quarto build)
</commit_message>
<xml_diff>
--- a/labs/lab12/report.docx
+++ b/labs/lab12/report.docx
@@ -18,13 +18,64 @@
         <w:t xml:space="preserve">Программирование в shell: основы</w:t>
       </w:r>
     </w:p>
-    <w:bookmarkStart w:id="9" w:name="цель-работы"/>
+    <w:p>
+      <w:pPr>
+        <w:pStyle w:val="Author"/>
+      </w:pPr>
+      <w:r>
+        <w:t xml:space="preserve">Савкин Дмитрий Вадимович</w:t>
+      </w:r>
+    </w:p>
+    <w:p>
+      <w:pPr>
+        <w:pStyle w:val="Date"/>
+      </w:pPr>
+      <w:r>
+        <w:t xml:space="preserve">2026-10-12</w:t>
+      </w:r>
+    </w:p>
+    <w:sdt>
+      <w:sdtPr>
+        <w:docPartObj>
+          <w:docPartGallery w:val="Table of Contents"/>
+          <w:docPartUnique/>
+        </w:docPartObj>
+      </w:sdtPr>
+      <w:sdtContent>
+        <w:p>
+          <w:pPr>
+            <w:pStyle w:val="TOCHeading"/>
+          </w:pPr>
+          <w:r>
+            <w:t xml:space="preserve">Содержание</w:t>
+          </w:r>
+        </w:p>
+        <w:p>
+          <w:r>
+            <w:fldChar w:fldCharType="begin" w:dirty="true"/>
+            <w:instrText xml:space="preserve">TOC \o "1-2" \h \z \u</w:instrText>
+            <w:fldChar w:fldCharType="separate"/>
+            <w:fldChar w:fldCharType="end"/>
+          </w:r>
+        </w:p>
+      </w:sdtContent>
+    </w:sdt>
+    <w:bookmarkStart w:id="15" w:name="введение"/>
     <w:p>
       <w:pPr>
         <w:pStyle w:val="Heading1"/>
       </w:pPr>
       <w:r>
-        <w:t xml:space="preserve">Цель работы</w:t>
+        <w:t xml:space="preserve">1. Введение</w:t>
+      </w:r>
+    </w:p>
+    <w:bookmarkStart w:id="9" w:name="актуальность"/>
+    <w:p>
+      <w:pPr>
+        <w:pStyle w:val="Heading2"/>
+      </w:pPr>
+      <w:r>
+        <w:t xml:space="preserve">1.1 Актуальность</w:t>
       </w:r>
     </w:p>
     <w:p>
@@ -32,17 +83,35 @@
         <w:pStyle w:val="FirstParagraph"/>
       </w:pPr>
       <w:r>
+        <w:t xml:space="preserve">Базовое программирование в shell автоматизирует рутинные задачи администрирования без необходимости компилируемых программ.</w:t>
+      </w:r>
+    </w:p>
+    <w:bookmarkEnd w:id="9"/>
+    <w:bookmarkStart w:id="10" w:name="цель-работы"/>
+    <w:p>
+      <w:pPr>
+        <w:pStyle w:val="Heading2"/>
+      </w:pPr>
+      <w:r>
+        <w:t xml:space="preserve">1.2 Цель работы</w:t>
+      </w:r>
+    </w:p>
+    <w:p>
+      <w:pPr>
+        <w:pStyle w:val="FirstParagraph"/>
+      </w:pPr>
+      <w:r>
         <w:t xml:space="preserve">Получение базовых навыков программирования в shell (bash), написание командных файлов.</w:t>
       </w:r>
     </w:p>
-    <w:bookmarkEnd w:id="9"/>
-    <w:bookmarkStart w:id="10" w:name="задание"/>
-    <w:p>
-      <w:pPr>
-        <w:pStyle w:val="Heading1"/>
-      </w:pPr>
-      <w:r>
-        <w:t xml:space="preserve">Задание</w:t>
+    <w:bookmarkEnd w:id="10"/>
+    <w:bookmarkStart w:id="11" w:name="задачи"/>
+    <w:p>
+      <w:pPr>
+        <w:pStyle w:val="Heading2"/>
+      </w:pPr>
+      <w:r>
+        <w:t xml:space="preserve">1.3 Задачи</w:t>
       </w:r>
     </w:p>
     <w:p>
@@ -93,14 +162,69 @@
         <w:t xml:space="preserve">Командный файл, считающий файлы заданного расширения в каталоге.</w:t>
       </w:r>
     </w:p>
-    <w:bookmarkEnd w:id="10"/>
-    <w:bookmarkStart w:id="26" w:name="выполнение-лабораторной-работы"/>
+    <w:bookmarkEnd w:id="11"/>
+    <w:bookmarkStart w:id="12" w:name="объект-и-предмет-исследования"/>
+    <w:p>
+      <w:pPr>
+        <w:pStyle w:val="Heading2"/>
+      </w:pPr>
+      <w:r>
+        <w:t xml:space="preserve">1.4 Объект и предмет исследования</w:t>
+      </w:r>
+    </w:p>
+    <w:p>
+      <w:pPr>
+        <w:pStyle w:val="FirstParagraph"/>
+      </w:pPr>
+      <w:r>
+        <w:t xml:space="preserve">Объект — командная оболочка bash; предмет — командные файлы с переменными и параметрами.</w:t>
+      </w:r>
+    </w:p>
+    <w:bookmarkEnd w:id="12"/>
+    <w:bookmarkStart w:id="13" w:name="методы-исследования"/>
+    <w:p>
+      <w:pPr>
+        <w:pStyle w:val="Heading2"/>
+      </w:pPr>
+      <w:r>
+        <w:t xml:space="preserve">1.5 Методы исследования</w:t>
+      </w:r>
+    </w:p>
+    <w:p>
+      <w:pPr>
+        <w:pStyle w:val="FirstParagraph"/>
+      </w:pPr>
+      <w:r>
+        <w:t xml:space="preserve">Эмпирический метод: практическое выполнение заданий в виртуальной машине Fedora Linux с фиксацией результатов скриншотами и видеозаписью.</w:t>
+      </w:r>
+    </w:p>
+    <w:bookmarkEnd w:id="13"/>
+    <w:bookmarkStart w:id="14" w:name="схема-выполнения-работы"/>
+    <w:p>
+      <w:pPr>
+        <w:pStyle w:val="Heading2"/>
+      </w:pPr>
+      <w:r>
+        <w:t xml:space="preserve">1.6 Схема выполнения работы</w:t>
+      </w:r>
+    </w:p>
+    <w:p>
+      <w:pPr>
+        <w:pStyle w:val="FirstParagraph"/>
+      </w:pPr>
+      <w:r>
+        <w:t xml:space="preserve">Работа выполнялась по стандартной схеме курса: выполнение действия в виртуальной машине, фиксация скриншотом, занесение в отчёт, публикация в git-репозиторий отдельным релизом.</w:t>
+      </w:r>
+    </w:p>
+    <w:bookmarkEnd w:id="14"/>
+    <w:bookmarkEnd w:id="15"/>
+    <w:bookmarkStart w:id="16" w:name="теоретическая-часть"/>
     <w:p>
       <w:pPr>
         <w:pStyle w:val="Heading1"/>
       </w:pPr>
       <w:r>
-        <w:t xml:space="preserve">Выполнение лабораторной работы</w:t>
+        <w:t xml:space="preserve">2. Теоретическая часть</w:t>
       </w:r>
     </w:p>
     <w:p>
@@ -108,6 +232,110 @@
         <w:pStyle w:val="FirstParagraph"/>
       </w:pPr>
       <w:r>
+        <w:t xml:space="preserve">Bash (Bourne Again Shell) — наиболее распространённая командная оболочка Unix/Linux, POSIX-совместимая. Командные файлы (скрипты) позволяют автоматизировать последовательности команд; переменные, позиционные параметры (</w:t>
+      </w:r>
+      <w:r>
+        <w:rPr>
+          <w:rStyle w:val="VerbatimChar"/>
+        </w:rPr>
+        <w:t xml:space="preserve">$1</w:t>
+      </w:r>
+      <w:r>
+        <w:t xml:space="preserve">…</w:t>
+      </w:r>
+      <w:r>
+        <w:rPr>
+          <w:rStyle w:val="VerbatimChar"/>
+        </w:rPr>
+        <w:t xml:space="preserve">$9</w:t>
+      </w:r>
+      <w:r>
+        <w:t xml:space="preserve">) и управляющие конструкции (</w:t>
+      </w:r>
+      <w:r>
+        <w:rPr>
+          <w:rStyle w:val="VerbatimChar"/>
+        </w:rPr>
+        <w:t xml:space="preserve">for</w:t>
+      </w:r>
+      <w:r>
+        <w:t xml:space="preserve">,</w:t>
+      </w:r>
+      <w:r>
+        <w:t xml:space="preserve"> </w:t>
+      </w:r>
+      <w:r>
+        <w:rPr>
+          <w:rStyle w:val="VerbatimChar"/>
+        </w:rPr>
+        <w:t xml:space="preserve">if</w:t>
+      </w:r>
+      <w:r>
+        <w:t xml:space="preserve">,</w:t>
+      </w:r>
+      <w:r>
+        <w:t xml:space="preserve"> </w:t>
+      </w:r>
+      <w:r>
+        <w:rPr>
+          <w:rStyle w:val="VerbatimChar"/>
+        </w:rPr>
+        <w:t xml:space="preserve">case</w:t>
+      </w:r>
+      <w:r>
+        <w:t xml:space="preserve">) образуют базовый набор средств процедурного программирования в shell.</w:t>
+      </w:r>
+    </w:p>
+    <w:p>
+      <w:pPr>
+        <w:pStyle w:val="BodyText"/>
+      </w:pPr>
+      <w:r>
+        <w:t xml:space="preserve">Более подробно см. в</w:t>
+      </w:r>
+      <w:r>
+        <w:t xml:space="preserve"> </w:t>
+      </w:r>
+      <w:r>
+        <w:t xml:space="preserve">[1,2]</w:t>
+      </w:r>
+      <w:r>
+        <w:t xml:space="preserve">.</w:t>
+      </w:r>
+    </w:p>
+    <w:bookmarkEnd w:id="16"/>
+    <w:bookmarkStart w:id="17" w:name="материалы-и-методы"/>
+    <w:p>
+      <w:pPr>
+        <w:pStyle w:val="Heading1"/>
+      </w:pPr>
+      <w:r>
+        <w:t xml:space="preserve">3. Материалы и методы</w:t>
+      </w:r>
+    </w:p>
+    <w:p>
+      <w:pPr>
+        <w:pStyle w:val="FirstParagraph"/>
+      </w:pPr>
+      <w:r>
+        <w:t xml:space="preserve">Используемое ПО и оборудование: хост-машина под управлением Windows, гипервизор VirtualBox, виртуальная машина с Fedora Linux (Sway), стандартные утилиты дистрибутива.</w:t>
+      </w:r>
+    </w:p>
+    <w:bookmarkEnd w:id="17"/>
+    <w:bookmarkStart w:id="33" w:name="выполнение-лабораторной-работы"/>
+    <w:p>
+      <w:pPr>
+        <w:pStyle w:val="Heading1"/>
+      </w:pPr>
+      <w:r>
+        <w:t xml:space="preserve">4. Выполнение лабораторной работы</w:t>
+      </w:r>
+    </w:p>
+    <w:p>
+      <w:pPr>
+        <w:pStyle w:val="FirstParagraph"/>
+      </w:pPr>
+      <w:r>
         <w:t xml:space="preserve">Создаём рабочий каталог:</w:t>
       </w:r>
       <w:r>
@@ -131,25 +359,25 @@
     </w:p>
     <w:p>
       <w:pPr>
-        <w:pStyle w:val="BodyText"/>
+        <w:pStyle w:val="CaptionedFigure"/>
       </w:pPr>
       <w:r>
         <w:drawing>
           <wp:inline>
             <wp:extent cx="3733800" cy="2100262"/>
             <wp:effectExtent b="0" l="0" r="0" t="0"/>
-            <wp:docPr descr="" title="" id="12" name="Picture"/>
+            <wp:docPr descr="Создаём рабочий каталог: ‘mkdir -p ~/work/os/lab12’, ‘cd ~/work/os/lab12’" title="" id="19" name="Picture"/>
             <a:graphic>
               <a:graphicData uri="http://schemas.openxmlformats.org/drawingml/2006/picture">
                 <pic:pic>
                   <pic:nvPicPr>
-                    <pic:cNvPr descr="фото/1.png" id="13" name="Picture"/>
+                    <pic:cNvPr descr="image/1.png" id="20" name="Picture"/>
                     <pic:cNvPicPr>
                       <a:picLocks noChangeArrowheads="1" noChangeAspect="1"/>
                     </pic:cNvPicPr>
                   </pic:nvPicPr>
                   <pic:blipFill>
-                    <a:blip r:embed="rId11"/>
+                    <a:blip r:embed="rId18"/>
                     <a:stretch>
                       <a:fillRect/>
                     </a:stretch>
@@ -178,6 +406,29 @@
     </w:p>
     <w:p>
       <w:pPr>
+        <w:pStyle w:val="ImageCaption"/>
+      </w:pPr>
+      <w:r>
+        <w:t xml:space="preserve">Создаём рабочий каталог:</w:t>
+      </w:r>
+      <w:r>
+        <w:t xml:space="preserve"> </w:t>
+      </w:r>
+      <w:r>
+        <w:t xml:space="preserve">‘mkdir -p ~/work/os/lab12’</w:t>
+      </w:r>
+      <w:r>
+        <w:t xml:space="preserve">,</w:t>
+      </w:r>
+      <w:r>
+        <w:t xml:space="preserve"> </w:t>
+      </w:r>
+      <w:r>
+        <w:t xml:space="preserve">‘cd ~/work/os/lab12’</w:t>
+      </w:r>
+    </w:p>
+    <w:p>
+      <w:pPr>
         <w:pStyle w:val="BodyText"/>
       </w:pPr>
       <w:r>
@@ -225,25 +476,25 @@
     </w:p>
     <w:p>
       <w:pPr>
-        <w:pStyle w:val="BodyText"/>
+        <w:pStyle w:val="CaptionedFigure"/>
       </w:pPr>
       <w:r>
         <w:drawing>
           <wp:inline>
             <wp:extent cx="3733800" cy="2100262"/>
             <wp:effectExtent b="0" l="0" r="0" t="0"/>
-            <wp:docPr descr="" title="" id="15" name="Picture"/>
+            <wp:docPr descr="Пишем task1_backup.sh - архивация своего кода в ‘~/backup’ через ‘tar’. Делаем исполняемым и запускаем: ‘chmod +x task1_backup.sh’, ‘./task1_backup.sh’" title="" id="22" name="Picture"/>
             <a:graphic>
               <a:graphicData uri="http://schemas.openxmlformats.org/drawingml/2006/picture">
                 <pic:pic>
                   <pic:nvPicPr>
-                    <pic:cNvPr descr="фото/2.png" id="16" name="Picture"/>
+                    <pic:cNvPr descr="image/2.png" id="23" name="Picture"/>
                     <pic:cNvPicPr>
                       <a:picLocks noChangeArrowheads="1" noChangeAspect="1"/>
                     </pic:cNvPicPr>
                   </pic:nvPicPr>
                   <pic:blipFill>
-                    <a:blip r:embed="rId14"/>
+                    <a:blip r:embed="rId21"/>
                     <a:stretch>
                       <a:fillRect/>
                     </a:stretch>
@@ -272,6 +523,50 @@
     </w:p>
     <w:p>
       <w:pPr>
+        <w:pStyle w:val="ImageCaption"/>
+      </w:pPr>
+      <w:r>
+        <w:t xml:space="preserve">Пишем task1_backup.sh - архивация своего кода в</w:t>
+      </w:r>
+      <w:r>
+        <w:t xml:space="preserve"> </w:t>
+      </w:r>
+      <w:r>
+        <w:t xml:space="preserve">‘~/backup’</w:t>
+      </w:r>
+      <w:r>
+        <w:t xml:space="preserve"> </w:t>
+      </w:r>
+      <w:r>
+        <w:t xml:space="preserve">через</w:t>
+      </w:r>
+      <w:r>
+        <w:t xml:space="preserve"> </w:t>
+      </w:r>
+      <w:r>
+        <w:t xml:space="preserve">‘tar’</w:t>
+      </w:r>
+      <w:r>
+        <w:t xml:space="preserve">. Делаем исполняемым и запускаем:</w:t>
+      </w:r>
+      <w:r>
+        <w:t xml:space="preserve"> </w:t>
+      </w:r>
+      <w:r>
+        <w:t xml:space="preserve">‘chmod +x task1_backup.sh’</w:t>
+      </w:r>
+      <w:r>
+        <w:t xml:space="preserve">,</w:t>
+      </w:r>
+      <w:r>
+        <w:t xml:space="preserve"> </w:t>
+      </w:r>
+      <w:r>
+        <w:t xml:space="preserve">‘./task1_backup.sh’</w:t>
+      </w:r>
+    </w:p>
+    <w:p>
+      <w:pPr>
         <w:pStyle w:val="BodyText"/>
       </w:pPr>
       <w:r>
@@ -307,25 +602,25 @@
     </w:p>
     <w:p>
       <w:pPr>
-        <w:pStyle w:val="BodyText"/>
+        <w:pStyle w:val="CaptionedFigure"/>
       </w:pPr>
       <w:r>
         <w:drawing>
           <wp:inline>
             <wp:extent cx="3733800" cy="2100262"/>
             <wp:effectExtent b="0" l="0" r="0" t="0"/>
-            <wp:docPr descr="" title="" id="18" name="Picture"/>
+            <wp:docPr descr="Пишем task2_numbers.sh - обработка до 10 числовых аргументов через цикл ‘for’ и арифметику ‘(( ))’. Запускаем: ‘./task2_numbers.sh 5 10 15’" title="" id="25" name="Picture"/>
             <a:graphic>
               <a:graphicData uri="http://schemas.openxmlformats.org/drawingml/2006/picture">
                 <pic:pic>
                   <pic:nvPicPr>
-                    <pic:cNvPr descr="фото/3.png" id="19" name="Picture"/>
+                    <pic:cNvPr descr="image/3.png" id="26" name="Picture"/>
                     <pic:cNvPicPr>
                       <a:picLocks noChangeArrowheads="1" noChangeAspect="1"/>
                     </pic:cNvPicPr>
                   </pic:nvPicPr>
                   <pic:blipFill>
-                    <a:blip r:embed="rId17"/>
+                    <a:blip r:embed="rId24"/>
                     <a:stretch>
                       <a:fillRect/>
                     </a:stretch>
@@ -354,6 +649,41 @@
     </w:p>
     <w:p>
       <w:pPr>
+        <w:pStyle w:val="ImageCaption"/>
+      </w:pPr>
+      <w:r>
+        <w:t xml:space="preserve">Пишем task2_numbers.sh - обработка до 10 числовых аргументов через цикл</w:t>
+      </w:r>
+      <w:r>
+        <w:t xml:space="preserve"> </w:t>
+      </w:r>
+      <w:r>
+        <w:t xml:space="preserve">‘for’</w:t>
+      </w:r>
+      <w:r>
+        <w:t xml:space="preserve"> </w:t>
+      </w:r>
+      <w:r>
+        <w:t xml:space="preserve">и арифметику</w:t>
+      </w:r>
+      <w:r>
+        <w:t xml:space="preserve"> </w:t>
+      </w:r>
+      <w:r>
+        <w:t xml:space="preserve">‘(( ))’</w:t>
+      </w:r>
+      <w:r>
+        <w:t xml:space="preserve">. Запускаем:</w:t>
+      </w:r>
+      <w:r>
+        <w:t xml:space="preserve"> </w:t>
+      </w:r>
+      <w:r>
+        <w:t xml:space="preserve">‘./task2_numbers.sh 5 10 15’</w:t>
+      </w:r>
+    </w:p>
+    <w:p>
+      <w:pPr>
         <w:pStyle w:val="BodyText"/>
       </w:pPr>
       <w:r>
@@ -371,25 +701,25 @@
     </w:p>
     <w:p>
       <w:pPr>
-        <w:pStyle w:val="BodyText"/>
+        <w:pStyle w:val="CaptionedFigure"/>
       </w:pPr>
       <w:r>
         <w:drawing>
           <wp:inline>
             <wp:extent cx="3733800" cy="2100262"/>
             <wp:effectExtent b="0" l="0" r="0" t="0"/>
-            <wp:docPr descr="" title="" id="21" name="Picture"/>
+            <wp:docPr descr="Пишем task3_dirinfo.sh - аналог ls, выводит имя/тип/права/размер каждого файла через ‘stat -c’. Запускаем без аргументов - показывает текущий каталог" title="" id="28" name="Picture"/>
             <a:graphic>
               <a:graphicData uri="http://schemas.openxmlformats.org/drawingml/2006/picture">
                 <pic:pic>
                   <pic:nvPicPr>
-                    <pic:cNvPr descr="фото/4.png" id="22" name="Picture"/>
+                    <pic:cNvPr descr="image/4.png" id="29" name="Picture"/>
                     <pic:cNvPicPr>
                       <a:picLocks noChangeArrowheads="1" noChangeAspect="1"/>
                     </pic:cNvPicPr>
                   </pic:nvPicPr>
                   <pic:blipFill>
-                    <a:blip r:embed="rId20"/>
+                    <a:blip r:embed="rId27"/>
                     <a:stretch>
                       <a:fillRect/>
                     </a:stretch>
@@ -418,6 +748,23 @@
     </w:p>
     <w:p>
       <w:pPr>
+        <w:pStyle w:val="ImageCaption"/>
+      </w:pPr>
+      <w:r>
+        <w:t xml:space="preserve">Пишем task3_dirinfo.sh - аналог ls, выводит имя/тип/права/размер каждого файла через</w:t>
+      </w:r>
+      <w:r>
+        <w:t xml:space="preserve"> </w:t>
+      </w:r>
+      <w:r>
+        <w:t xml:space="preserve">‘stat -c’</w:t>
+      </w:r>
+      <w:r>
+        <w:t xml:space="preserve">. Запускаем без аргументов - показывает текущий каталог</w:t>
+      </w:r>
+    </w:p>
+    <w:p>
+      <w:pPr>
         <w:pStyle w:val="BodyText"/>
       </w:pPr>
       <w:r>
@@ -474,25 +821,25 @@
     </w:p>
     <w:p>
       <w:pPr>
-        <w:pStyle w:val="BodyText"/>
+        <w:pStyle w:val="CaptionedFigure"/>
       </w:pPr>
       <w:r>
         <w:drawing>
           <wp:inline>
             <wp:extent cx="3733800" cy="2100262"/>
             <wp:effectExtent b="0" l="0" r="0" t="0"/>
-            <wp:docPr descr="" title="" id="24" name="Picture"/>
+            <wp:docPr descr="Пишем task4_countext.sh - принимает расширение и путь, считает файлы через ‘find’ и ‘wc -l’. Создаём тестовые файлы и проверяем: ‘touch a.txt c.jpg d.jpg’, ‘./task4_countext.sh .txt .’, ‘./task4_countext.sh .jpg .’" title="" id="31" name="Picture"/>
             <a:graphic>
               <a:graphicData uri="http://schemas.openxmlformats.org/drawingml/2006/picture">
                 <pic:pic>
                   <pic:nvPicPr>
-                    <pic:cNvPr descr="фото/5.png" id="25" name="Picture"/>
+                    <pic:cNvPr descr="image/5.png" id="32" name="Picture"/>
                     <pic:cNvPicPr>
                       <a:picLocks noChangeArrowheads="1" noChangeAspect="1"/>
                     </pic:cNvPicPr>
                   </pic:nvPicPr>
                   <pic:blipFill>
-                    <a:blip r:embed="rId23"/>
+                    <a:blip r:embed="rId30"/>
                     <a:stretch>
                       <a:fillRect/>
                     </a:stretch>
@@ -519,14 +866,67 @@
         </w:drawing>
       </w:r>
     </w:p>
-    <w:bookmarkEnd w:id="26"/>
-    <w:bookmarkStart w:id="27" w:name="выводы"/>
+    <w:p>
+      <w:pPr>
+        <w:pStyle w:val="ImageCaption"/>
+      </w:pPr>
+      <w:r>
+        <w:t xml:space="preserve">Пишем task4_countext.sh - принимает расширение и путь, считает файлы через</w:t>
+      </w:r>
+      <w:r>
+        <w:t xml:space="preserve"> </w:t>
+      </w:r>
+      <w:r>
+        <w:t xml:space="preserve">‘find’</w:t>
+      </w:r>
+      <w:r>
+        <w:t xml:space="preserve"> </w:t>
+      </w:r>
+      <w:r>
+        <w:t xml:space="preserve">и</w:t>
+      </w:r>
+      <w:r>
+        <w:t xml:space="preserve"> </w:t>
+      </w:r>
+      <w:r>
+        <w:t xml:space="preserve">‘wc -l’</w:t>
+      </w:r>
+      <w:r>
+        <w:t xml:space="preserve">. Создаём тестовые файлы и проверяем:</w:t>
+      </w:r>
+      <w:r>
+        <w:t xml:space="preserve"> </w:t>
+      </w:r>
+      <w:r>
+        <w:t xml:space="preserve">‘touch a.txt c.jpg d.jpg’</w:t>
+      </w:r>
+      <w:r>
+        <w:t xml:space="preserve">,</w:t>
+      </w:r>
+      <w:r>
+        <w:t xml:space="preserve"> </w:t>
+      </w:r>
+      <w:r>
+        <w:t xml:space="preserve">‘./task4_countext.sh .txt .’</w:t>
+      </w:r>
+      <w:r>
+        <w:t xml:space="preserve">,</w:t>
+      </w:r>
+      <w:r>
+        <w:t xml:space="preserve"> </w:t>
+      </w:r>
+      <w:r>
+        <w:t xml:space="preserve">‘./task4_countext.sh .jpg .’</w:t>
+      </w:r>
+    </w:p>
+    <w:bookmarkEnd w:id="33"/>
+    <w:bookmarkStart w:id="34" w:name="результаты"/>
     <w:p>
       <w:pPr>
         <w:pStyle w:val="Heading1"/>
       </w:pPr>
       <w:r>
-        <w:t xml:space="preserve">Выводы</w:t>
+        <w:t xml:space="preserve">5. Результаты</w:t>
       </w:r>
     </w:p>
     <w:p>
@@ -534,6 +934,51 @@
         <w:pStyle w:val="FirstParagraph"/>
       </w:pPr>
       <w:r>
+        <w:t xml:space="preserve">В ходе выполнения работы получены следующие объективные результаты: Освоены основы shell-программирования: переменные, позиционные параметры, циклы, условия, арифметика, работа с</w:t>
+      </w:r>
+      <w:r>
+        <w:t xml:space="preserve"> </w:t>
+      </w:r>
+      <w:r>
+        <w:t xml:space="preserve">‘find/stat’</w:t>
+      </w:r>
+      <w:r>
+        <w:t xml:space="preserve">, создание и запуск исполняемых командных файлов.</w:t>
+      </w:r>
+    </w:p>
+    <w:bookmarkEnd w:id="34"/>
+    <w:bookmarkStart w:id="35" w:name="обсуждение-результатов"/>
+    <w:p>
+      <w:pPr>
+        <w:pStyle w:val="Heading1"/>
+      </w:pPr>
+      <w:r>
+        <w:t xml:space="preserve">6. Обсуждение результатов</w:t>
+      </w:r>
+    </w:p>
+    <w:p>
+      <w:pPr>
+        <w:pStyle w:val="FirstParagraph"/>
+      </w:pPr>
+      <w:r>
+        <w:t xml:space="preserve">Все 4 командных файла отработали корректно на тестовых данных; отклонений от расчётного поведения не выявлено.</w:t>
+      </w:r>
+    </w:p>
+    <w:bookmarkEnd w:id="35"/>
+    <w:bookmarkStart w:id="36" w:name="заключение"/>
+    <w:p>
+      <w:pPr>
+        <w:pStyle w:val="Heading1"/>
+      </w:pPr>
+      <w:r>
+        <w:t xml:space="preserve">7. Заключение</w:t>
+      </w:r>
+    </w:p>
+    <w:p>
+      <w:pPr>
+        <w:pStyle w:val="FirstParagraph"/>
+      </w:pPr>
+      <w:r>
         <w:t xml:space="preserve">Освоены основы shell-программирования: переменные, позиционные параметры, циклы, условия, арифметика, работа с</w:t>
       </w:r>
       <w:r>
@@ -546,8 +991,58 @@
         <w:t xml:space="preserve">, создание и запуск исполняемых командных файлов.</w:t>
       </w:r>
     </w:p>
-    <w:bookmarkEnd w:id="27"/>
-    <w:bookmarkStart w:id="28" w:name="ответы-на-контрольные-вопросы"/>
+    <w:bookmarkEnd w:id="36"/>
+    <w:bookmarkStart w:id="40" w:name="список-литературы"/>
+    <w:p>
+      <w:pPr>
+        <w:pStyle w:val="Heading1"/>
+      </w:pPr>
+      <w:r>
+        <w:t xml:space="preserve">Список литературы</w:t>
+      </w:r>
+    </w:p>
+    <w:bookmarkStart w:id="39" w:name="refs"/>
+    <w:bookmarkStart w:id="37" w:name="ref-newham_book_learning-bash_en"/>
+    <w:p>
+      <w:pPr>
+        <w:pStyle w:val="Bibliography"/>
+      </w:pPr>
+      <w:r>
+        <w:t xml:space="preserve">1.</w:t>
+      </w:r>
+      <w:r>
+        <w:t xml:space="preserve"> </w:t>
+      </w:r>
+      <w:r>
+        <w:t xml:space="preserve">	</w:t>
+      </w:r>
+      <w:r>
+        <w:t xml:space="preserve">Newham C., Rosenblatt B. Learning the bash Shell. O’Reilly Media, 2005.</w:t>
+      </w:r>
+    </w:p>
+    <w:bookmarkEnd w:id="37"/>
+    <w:bookmarkStart w:id="38" w:name="ref-robbins_book_bash_en"/>
+    <w:p>
+      <w:pPr>
+        <w:pStyle w:val="Bibliography"/>
+      </w:pPr>
+      <w:r>
+        <w:t xml:space="preserve">2.</w:t>
+      </w:r>
+      <w:r>
+        <w:t xml:space="preserve"> </w:t>
+      </w:r>
+      <w:r>
+        <w:t xml:space="preserve">	</w:t>
+      </w:r>
+      <w:r>
+        <w:t xml:space="preserve">Robbins A. Bash Pocket Reference. O’Reilly Media, 2016.</w:t>
+      </w:r>
+    </w:p>
+    <w:bookmarkEnd w:id="38"/>
+    <w:bookmarkEnd w:id="39"/>
+    <w:bookmarkEnd w:id="40"/>
+    <w:bookmarkStart w:id="41" w:name="ответы-на-контрольные-вопросы"/>
     <w:p>
       <w:pPr>
         <w:pStyle w:val="Heading1"/>
@@ -960,7 +1455,7 @@
         <w:t xml:space="preserve">$0 имя скрипта $1 - $9 аргументы, $# их число, $? код завершения, $$ PID процесса, $! PID фонового процесса.</w:t>
       </w:r>
     </w:p>
-    <w:bookmarkEnd w:id="28"/>
+    <w:bookmarkEnd w:id="41"/>
     <w:sectPr>
       <w:footnotePr>
         <w:numRestart w:val="eachSect"/>
@@ -1203,10 +1698,10 @@
   <w:docDefaults>
     <w:rPrDefault>
       <w:rPr>
-        <w:rFonts w:asciiTheme="minorHAnsi" w:cstheme="minorBidi" w:eastAsiaTheme="minorHAnsi" w:hAnsiTheme="minorHAnsi"/>
+        <w:rFonts w:asciiTheme="minorHAnsi" w:cstheme="minorBidi" w:eastAsiaTheme="minorEastAsia" w:hAnsiTheme="minorHAnsi"/>
         <w:sz w:val="24"/>
         <w:szCs w:val="24"/>
-        <w:lang w:bidi="ar-SA" w:eastAsia="en-US" w:val="en-US"/>
+        <w:lang w:bidi="ar-SA" w:eastAsia="zh-CN" w:val="ru-RU"/>
       </w:rPr>
     </w:rPrDefault>
     <w:pPrDefault>
@@ -1747,13 +2242,6 @@
       </w:tblCellMar>
     </w:tblPr>
     <w:tblStylePr w:type="firstRow">
-      <w:tblPr>
-        <w:jc w:val="left"/>
-        <w:tblInd w:type="dxa" w:w="0"/>
-      </w:tblPr>
-      <w:trPr>
-        <w:jc w:val="left"/>
-      </w:trPr>
       <w:tcPr>
         <w:tcBorders>
           <w:bottom w:val="single"/>
@@ -1867,6 +2355,7 @@
     <w:link w:val="VerbatimChar"/>
     <w:pPr>
       <w:wordWrap w:val="off"/>
+      <w:shd w:val="clear" w:fill="f1f3f5"/>
     </w:pPr>
   </w:style>
   <w:style w:type="character" w:customStyle="1" w:styleId="KeywordTok">
@@ -1874,93 +2363,104 @@
     <w:basedOn w:val="VerbatimChar"/>
     <w:rPr>
       <w:b/>
-      <w:color w:val="007020"/>
+      <w:color w:val="003b4f"/>
+      <w:shd w:val="clear" w:fill="f1f3f5"/>
     </w:rPr>
   </w:style>
   <w:style w:type="character" w:customStyle="1" w:styleId="DataTypeTok">
     <w:name w:val="DataTypeTok"/>
     <w:basedOn w:val="VerbatimChar"/>
     <w:rPr>
-      <w:color w:val="902000"/>
+      <w:color w:val="ad0000"/>
+      <w:shd w:val="clear" w:fill="f1f3f5"/>
     </w:rPr>
   </w:style>
   <w:style w:type="character" w:customStyle="1" w:styleId="DecValTok">
     <w:name w:val="DecValTok"/>
     <w:basedOn w:val="VerbatimChar"/>
     <w:rPr>
-      <w:color w:val="40a070"/>
+      <w:color w:val="ad0000"/>
+      <w:shd w:val="clear" w:fill="f1f3f5"/>
     </w:rPr>
   </w:style>
   <w:style w:type="character" w:customStyle="1" w:styleId="BaseNTok">
     <w:name w:val="BaseNTok"/>
     <w:basedOn w:val="VerbatimChar"/>
     <w:rPr>
-      <w:color w:val="40a070"/>
+      <w:color w:val="ad0000"/>
+      <w:shd w:val="clear" w:fill="f1f3f5"/>
     </w:rPr>
   </w:style>
   <w:style w:type="character" w:customStyle="1" w:styleId="FloatTok">
     <w:name w:val="FloatTok"/>
     <w:basedOn w:val="VerbatimChar"/>
     <w:rPr>
-      <w:color w:val="40a070"/>
+      <w:color w:val="ad0000"/>
+      <w:shd w:val="clear" w:fill="f1f3f5"/>
     </w:rPr>
   </w:style>
   <w:style w:type="character" w:customStyle="1" w:styleId="ConstantTok">
     <w:name w:val="ConstantTok"/>
     <w:basedOn w:val="VerbatimChar"/>
     <w:rPr>
-      <w:color w:val="880000"/>
+      <w:color w:val="8f5902"/>
+      <w:shd w:val="clear" w:fill="f1f3f5"/>
     </w:rPr>
   </w:style>
   <w:style w:type="character" w:customStyle="1" w:styleId="CharTok">
     <w:name w:val="CharTok"/>
     <w:basedOn w:val="VerbatimChar"/>
     <w:rPr>
-      <w:color w:val="4070a0"/>
+      <w:color w:val="20794d"/>
+      <w:shd w:val="clear" w:fill="f1f3f5"/>
     </w:rPr>
   </w:style>
   <w:style w:type="character" w:customStyle="1" w:styleId="SpecialCharTok">
     <w:name w:val="SpecialCharTok"/>
     <w:basedOn w:val="VerbatimChar"/>
     <w:rPr>
-      <w:color w:val="4070a0"/>
+      <w:color w:val="5e5e5e"/>
+      <w:shd w:val="clear" w:fill="f1f3f5"/>
     </w:rPr>
   </w:style>
   <w:style w:type="character" w:customStyle="1" w:styleId="StringTok">
     <w:name w:val="StringTok"/>
     <w:basedOn w:val="VerbatimChar"/>
     <w:rPr>
-      <w:color w:val="4070a0"/>
+      <w:color w:val="20794d"/>
+      <w:shd w:val="clear" w:fill="f1f3f5"/>
     </w:rPr>
   </w:style>
   <w:style w:type="character" w:customStyle="1" w:styleId="VerbatimStringTok">
     <w:name w:val="VerbatimStringTok"/>
     <w:basedOn w:val="VerbatimChar"/>
     <w:rPr>
-      <w:color w:val="4070a0"/>
+      <w:color w:val="20794d"/>
+      <w:shd w:val="clear" w:fill="f1f3f5"/>
     </w:rPr>
   </w:style>
   <w:style w:type="character" w:customStyle="1" w:styleId="SpecialStringTok">
     <w:name w:val="SpecialStringTok"/>
     <w:basedOn w:val="VerbatimChar"/>
     <w:rPr>
-      <w:color w:val="bb6688"/>
+      <w:color w:val="20794d"/>
+      <w:shd w:val="clear" w:fill="f1f3f5"/>
     </w:rPr>
   </w:style>
   <w:style w:type="character" w:customStyle="1" w:styleId="ImportTok">
     <w:name w:val="ImportTok"/>
     <w:basedOn w:val="VerbatimChar"/>
     <w:rPr>
-      <w:b/>
-      <w:color w:val="008000"/>
+      <w:color w:val="00769e"/>
+      <w:shd w:val="clear" w:fill="f1f3f5"/>
     </w:rPr>
   </w:style>
   <w:style w:type="character" w:customStyle="1" w:styleId="CommentTok">
     <w:name w:val="CommentTok"/>
     <w:basedOn w:val="VerbatimChar"/>
     <w:rPr>
-      <w:i/>
-      <w:color w:val="60a0b0"/>
+      <w:color w:val="5e5e5e"/>
+      <w:shd w:val="clear" w:fill="f1f3f5"/>
     </w:rPr>
   </w:style>
   <w:style w:type="character" w:customStyle="1" w:styleId="DocumentationTok">
@@ -1968,46 +2468,49 @@
     <w:basedOn w:val="VerbatimChar"/>
     <w:rPr>
       <w:i/>
-      <w:color w:val="ba2121"/>
+      <w:color w:val="5e5e5e"/>
+      <w:shd w:val="clear" w:fill="f1f3f5"/>
     </w:rPr>
   </w:style>
   <w:style w:type="character" w:customStyle="1" w:styleId="AnnotationTok">
     <w:name w:val="AnnotationTok"/>
     <w:basedOn w:val="VerbatimChar"/>
     <w:rPr>
-      <w:b/>
-      <w:i/>
-      <w:color w:val="60a0b0"/>
+      <w:color w:val="5e5e5e"/>
+      <w:shd w:val="clear" w:fill="f1f3f5"/>
     </w:rPr>
   </w:style>
   <w:style w:type="character" w:customStyle="1" w:styleId="CommentVarTok">
     <w:name w:val="CommentVarTok"/>
     <w:basedOn w:val="VerbatimChar"/>
     <w:rPr>
-      <w:b/>
       <w:i/>
-      <w:color w:val="60a0b0"/>
+      <w:color w:val="5e5e5e"/>
+      <w:shd w:val="clear" w:fill="f1f3f5"/>
     </w:rPr>
   </w:style>
   <w:style w:type="character" w:customStyle="1" w:styleId="OtherTok">
     <w:name w:val="OtherTok"/>
     <w:basedOn w:val="VerbatimChar"/>
     <w:rPr>
-      <w:color w:val="007020"/>
+      <w:color w:val="003b4f"/>
+      <w:shd w:val="clear" w:fill="f1f3f5"/>
     </w:rPr>
   </w:style>
   <w:style w:type="character" w:customStyle="1" w:styleId="FunctionTok">
     <w:name w:val="FunctionTok"/>
     <w:basedOn w:val="VerbatimChar"/>
     <w:rPr>
-      <w:color w:val="06287e"/>
+      <w:color w:val="4758ab"/>
+      <w:shd w:val="clear" w:fill="f1f3f5"/>
     </w:rPr>
   </w:style>
   <w:style w:type="character" w:customStyle="1" w:styleId="VariableTok">
     <w:name w:val="VariableTok"/>
     <w:basedOn w:val="VerbatimChar"/>
     <w:rPr>
-      <w:color w:val="19177c"/>
+      <w:color w:val="111111"/>
+      <w:shd w:val="clear" w:fill="f1f3f5"/>
     </w:rPr>
   </w:style>
   <w:style w:type="character" w:customStyle="1" w:styleId="ControlFlowTok">
@@ -2015,85 +2518,98 @@
     <w:basedOn w:val="VerbatimChar"/>
     <w:rPr>
       <w:b/>
-      <w:color w:val="007020"/>
+      <w:color w:val="003b4f"/>
+      <w:shd w:val="clear" w:fill="f1f3f5"/>
     </w:rPr>
   </w:style>
   <w:style w:type="character" w:customStyle="1" w:styleId="OperatorTok">
     <w:name w:val="OperatorTok"/>
     <w:basedOn w:val="VerbatimChar"/>
     <w:rPr>
-      <w:color w:val="666666"/>
+      <w:color w:val="5e5e5e"/>
+      <w:shd w:val="clear" w:fill="f1f3f5"/>
     </w:rPr>
   </w:style>
   <w:style w:type="character" w:customStyle="1" w:styleId="BuiltInTok">
     <w:name w:val="BuiltInTok"/>
     <w:basedOn w:val="VerbatimChar"/>
     <w:rPr>
-      <w:color w:val="008000"/>
+      <w:color w:val="003b4f"/>
+      <w:shd w:val="clear" w:fill="f1f3f5"/>
     </w:rPr>
   </w:style>
   <w:style w:type="character" w:customStyle="1" w:styleId="ExtensionTok">
     <w:name w:val="ExtensionTok"/>
     <w:basedOn w:val="VerbatimChar"/>
-    <w:rPr/>
+    <w:rPr>
+      <w:color w:val="003b4f"/>
+      <w:shd w:val="clear" w:fill="f1f3f5"/>
+    </w:rPr>
   </w:style>
   <w:style w:type="character" w:customStyle="1" w:styleId="PreprocessorTok">
     <w:name w:val="PreprocessorTok"/>
     <w:basedOn w:val="VerbatimChar"/>
     <w:rPr>
-      <w:color w:val="bc7a00"/>
+      <w:color w:val="ad0000"/>
+      <w:shd w:val="clear" w:fill="f1f3f5"/>
     </w:rPr>
   </w:style>
   <w:style w:type="character" w:customStyle="1" w:styleId="AttributeTok">
     <w:name w:val="AttributeTok"/>
     <w:basedOn w:val="VerbatimChar"/>
     <w:rPr>
-      <w:color w:val="7d9029"/>
+      <w:color w:val="657422"/>
+      <w:shd w:val="clear" w:fill="f1f3f5"/>
     </w:rPr>
   </w:style>
   <w:style w:type="character" w:customStyle="1" w:styleId="RegionMarkerTok">
     <w:name w:val="RegionMarkerTok"/>
     <w:basedOn w:val="VerbatimChar"/>
-    <w:rPr/>
+    <w:rPr>
+      <w:color w:val="003b4f"/>
+      <w:shd w:val="clear" w:fill="f1f3f5"/>
+    </w:rPr>
   </w:style>
   <w:style w:type="character" w:customStyle="1" w:styleId="InformationTok">
     <w:name w:val="InformationTok"/>
     <w:basedOn w:val="VerbatimChar"/>
     <w:rPr>
-      <w:b/>
-      <w:i/>
-      <w:color w:val="60a0b0"/>
+      <w:color w:val="5e5e5e"/>
+      <w:shd w:val="clear" w:fill="f1f3f5"/>
     </w:rPr>
   </w:style>
   <w:style w:type="character" w:customStyle="1" w:styleId="WarningTok">
     <w:name w:val="WarningTok"/>
     <w:basedOn w:val="VerbatimChar"/>
     <w:rPr>
-      <w:b/>
       <w:i/>
-      <w:color w:val="60a0b0"/>
+      <w:color w:val="5e5e5e"/>
+      <w:shd w:val="clear" w:fill="f1f3f5"/>
     </w:rPr>
   </w:style>
   <w:style w:type="character" w:customStyle="1" w:styleId="AlertTok">
     <w:name w:val="AlertTok"/>
     <w:basedOn w:val="VerbatimChar"/>
     <w:rPr>
-      <w:b/>
-      <w:color w:val="ff0000"/>
+      <w:color w:val="ad0000"/>
+      <w:shd w:val="clear" w:fill="f1f3f5"/>
     </w:rPr>
   </w:style>
   <w:style w:type="character" w:customStyle="1" w:styleId="ErrorTok">
     <w:name w:val="ErrorTok"/>
     <w:basedOn w:val="VerbatimChar"/>
     <w:rPr>
-      <w:b/>
-      <w:color w:val="ff0000"/>
+      <w:color w:val="ad0000"/>
+      <w:shd w:val="clear" w:fill="f1f3f5"/>
     </w:rPr>
   </w:style>
   <w:style w:type="character" w:customStyle="1" w:styleId="NormalTok">
     <w:name w:val="NormalTok"/>
     <w:basedOn w:val="VerbatimChar"/>
-    <w:rPr/>
+    <w:rPr>
+      <w:color w:val="003b4f"/>
+      <w:shd w:val="clear" w:fill="f1f3f5"/>
+    </w:rPr>
   </w:style>
 </w:styles>
 </file>

</xml_diff>